<commit_message>
miChecker update to include fix for XXE Vulnerability  #24
</commit_message>
<xml_diff>
--- a/org.eclipse.actf.examples.michecker.doc.nl1/manual_src/miChecker_install.docx
+++ b/org.eclipse.actf.examples.michecker.doc.nl1/manual_src/miChecker_install.docx
@@ -205,7 +205,7 @@
         <w:rPr>
           <w:rFonts w:ascii="HG丸ｺﾞｼｯｸM-PRO" w:eastAsia="HG丸ｺﾞｼｯｸM-PRO" w:hAnsi="HG丸ｺﾞｼｯｸM-PRO" w:cs="Arial" w:hint="eastAsia"/>
         </w:rPr>
-        <w:t>６</w:t>
+        <w:t>7</w:t>
       </w:r>
       <w:r>
         <w:rPr>
@@ -1794,16 +1794,16 @@
         <mc:AlternateContent>
           <mc:Choice Requires="wps">
             <w:drawing>
-              <wp:anchor distT="0" distB="0" distL="114300" distR="114300" simplePos="0" relativeHeight="251655680" behindDoc="0" locked="0" layoutInCell="1" allowOverlap="1" wp14:anchorId="29499A37" wp14:editId="0D49DADA">
+              <wp:anchor distT="0" distB="0" distL="114300" distR="114300" simplePos="0" relativeHeight="251655680" behindDoc="0" locked="0" layoutInCell="1" allowOverlap="1" wp14:anchorId="29499A37" wp14:editId="75DD675B">
                 <wp:simplePos x="0" y="0"/>
                 <wp:positionH relativeFrom="column">
-                  <wp:posOffset>105410</wp:posOffset>
+                  <wp:posOffset>-90805</wp:posOffset>
                 </wp:positionH>
                 <wp:positionV relativeFrom="paragraph">
-                  <wp:posOffset>1208405</wp:posOffset>
+                  <wp:posOffset>1109345</wp:posOffset>
                 </wp:positionV>
-                <wp:extent cx="2787015" cy="274320"/>
-                <wp:effectExtent l="15240" t="22860" r="17145" b="17145"/>
+                <wp:extent cx="2337435" cy="577215"/>
+                <wp:effectExtent l="19050" t="19050" r="24765" b="13335"/>
                 <wp:wrapNone/>
                 <wp:docPr id="18" name="AutoShape 591">
                   <a:extLst xmlns:a="http://schemas.openxmlformats.org/drawingml/2006/main">
@@ -1824,7 +1824,7 @@
                       <wps:spPr bwMode="auto">
                         <a:xfrm>
                           <a:off x="0" y="0"/>
-                          <a:ext cx="2787015" cy="274320"/>
+                          <a:ext cx="2337435" cy="577215"/>
                         </a:xfrm>
                         <a:prstGeom prst="roundRect">
                           <a:avLst>
@@ -1867,7 +1867,7 @@
           </mc:Choice>
           <mc:Fallback>
             <w:pict>
-              <v:roundrect w14:anchorId="4C5DDD89" id="AutoShape 591" o:spid="_x0000_s1026" alt="&quot;&quot;" style="position:absolute;left:0;text-align:left;margin-left:8.3pt;margin-top:95.15pt;width:219.45pt;height:21.6pt;z-index:251655680;visibility:visible;mso-wrap-style:square;mso-width-percent:0;mso-height-percent:0;mso-wrap-distance-left:9pt;mso-wrap-distance-top:0;mso-wrap-distance-right:9pt;mso-wrap-distance-bottom:0;mso-position-horizontal:absolute;mso-position-horizontal-relative:text;mso-position-vertical:absolute;mso-position-vertical-relative:text;mso-width-percent:0;mso-height-percent:0;mso-width-relative:page;mso-height-relative:page;v-text-anchor:top" arcsize="10923f" o:gfxdata="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" filled="f" strokecolor="red" strokeweight="2.25pt">
+              <v:roundrect w14:anchorId="061F231B" id="AutoShape 591" o:spid="_x0000_s1026" alt="&quot;&quot;" style="position:absolute;margin-left:-7.15pt;margin-top:87.35pt;width:184.05pt;height:45.45pt;z-index:251655680;visibility:visible;mso-wrap-style:square;mso-width-percent:0;mso-height-percent:0;mso-wrap-distance-left:9pt;mso-wrap-distance-top:0;mso-wrap-distance-right:9pt;mso-wrap-distance-bottom:0;mso-position-horizontal:absolute;mso-position-horizontal-relative:text;mso-position-vertical:absolute;mso-position-vertical-relative:text;mso-width-percent:0;mso-height-percent:0;mso-width-relative:page;mso-height-relative:page;v-text-anchor:top" arcsize="10923f" o:gfxdata="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" filled="f" strokecolor="red" strokeweight="2.25pt">
                 <v:textbox inset="5.85pt,.7pt,5.85pt,.7pt"/>
               </v:roundrect>
             </w:pict>
@@ -1879,9 +1879,9 @@
           <w:noProof/>
         </w:rPr>
         <w:drawing>
-          <wp:inline distT="0" distB="0" distL="0" distR="0" wp14:anchorId="01775CCE" wp14:editId="1EBCA5CA">
-            <wp:extent cx="6245914" cy="2026920"/>
-            <wp:effectExtent l="19050" t="19050" r="21590" b="11430"/>
+          <wp:inline distT="0" distB="0" distL="0" distR="0" wp14:anchorId="01775CCE" wp14:editId="410CAD67">
+            <wp:extent cx="6245914" cy="1963144"/>
+            <wp:effectExtent l="19050" t="19050" r="21590" b="18415"/>
             <wp:docPr id="2" name="図 1">
               <a:extLst xmlns:a="http://schemas.openxmlformats.org/drawingml/2006/main">
                 <a:ext uri="{C183D7F6-B498-43B3-948B-1728B52AA6E4}">
@@ -1922,7 +1922,7 @@
                   <pic:spPr bwMode="auto">
                     <a:xfrm>
                       <a:off x="0" y="0"/>
-                      <a:ext cx="6245914" cy="2026920"/>
+                      <a:ext cx="6245914" cy="1963144"/>
                     </a:xfrm>
                     <a:prstGeom prst="rect">
                       <a:avLst/>
@@ -2222,7 +2222,7 @@
           <w:noProof/>
         </w:rPr>
         <w:drawing>
-          <wp:inline distT="0" distB="0" distL="0" distR="0" wp14:anchorId="5B2FF4A5" wp14:editId="650D19E9">
+          <wp:inline distT="0" distB="0" distL="0" distR="0" wp14:anchorId="5B2FF4A5" wp14:editId="49D3081E">
             <wp:extent cx="2849880" cy="2385060"/>
             <wp:effectExtent l="0" t="0" r="0" b="0"/>
             <wp:docPr id="3" name="図 1">
@@ -2373,7 +2373,13 @@
         <w:rPr>
           <w:rFonts w:ascii="ＭＳ 明朝" w:hAnsi="ＭＳ 明朝"/>
         </w:rPr>
-        <w:t>_1</w:t>
+        <w:t>_</w:t>
+      </w:r>
+      <w:r>
+        <w:rPr>
+          <w:rFonts w:ascii="ＭＳ 明朝" w:hAnsi="ＭＳ 明朝" w:hint="eastAsia"/>
+        </w:rPr>
+        <w:t>2</w:t>
       </w:r>
       <w:r>
         <w:rPr>
@@ -2904,7 +2910,10 @@
                               <w:t>_</w:t>
                             </w:r>
                             <w:r>
-                              <w:t>1</w:t>
+                              <w:rPr>
+                                <w:rFonts w:hint="eastAsia"/>
+                              </w:rPr>
+                              <w:t>2</w:t>
                             </w:r>
                             <w:r>
                               <w:rPr>
@@ -3022,7 +3031,10 @@
                         <w:t>_</w:t>
                       </w:r>
                       <w:r>
-                        <w:t>1</w:t>
+                        <w:rPr>
+                          <w:rFonts w:hint="eastAsia"/>
+                        </w:rPr>
+                        <w:t>2</w:t>
                       </w:r>
                       <w:r>
                         <w:rPr>
@@ -3817,21 +3829,7 @@
         <w:rPr>
           <w:rFonts w:ascii="ＭＳ 明朝" w:hAnsi="ＭＳ 明朝" w:hint="eastAsia"/>
         </w:rPr>
-        <w:t>「名前」と記載された入力欄に「</w:t>
-      </w:r>
-      <w:proofErr w:type="spellStart"/>
-      <w:r>
-        <w:rPr>
-          <w:rFonts w:ascii="ＭＳ 明朝" w:hAnsi="ＭＳ 明朝" w:hint="eastAsia"/>
-        </w:rPr>
-        <w:t>cmd</w:t>
-      </w:r>
-      <w:proofErr w:type="spellEnd"/>
-      <w:r>
-        <w:rPr>
-          <w:rFonts w:ascii="ＭＳ 明朝" w:hAnsi="ＭＳ 明朝" w:hint="eastAsia"/>
-        </w:rPr>
-        <w:t>」と入力し</w:t>
+        <w:t>「名前」と記載された入力欄に「cmd」と入力し</w:t>
       </w:r>
       <w:r>
         <w:rPr>
@@ -4506,13 +4504,8 @@
         </w:pBdr>
         <w:ind w:leftChars="337" w:left="708"/>
       </w:pPr>
-      <w:proofErr w:type="spellStart"/>
-      <w:r>
-        <w:t>openjdk</w:t>
-      </w:r>
-      <w:proofErr w:type="spellEnd"/>
-      <w:r>
-        <w:t xml:space="preserve"> version "17.0.5" 2022-10-18</w:t>
+      <w:r>
+        <w:t>openjdk version "17.0.5" 2022-10-18</w:t>
       </w:r>
     </w:p>
     <w:p>
@@ -4526,15 +4519,7 @@
         <w:ind w:leftChars="337" w:left="708"/>
       </w:pPr>
       <w:r>
-        <w:t xml:space="preserve">IBM </w:t>
-      </w:r>
-      <w:proofErr w:type="spellStart"/>
-      <w:r>
-        <w:t>Semeru</w:t>
-      </w:r>
-      <w:proofErr w:type="spellEnd"/>
-      <w:r>
-        <w:t xml:space="preserve"> Runtime Open Edition 17.0.5.0 (build 17.0.5+8)</w:t>
+        <w:t>IBM Semeru Runtime Open Edition 17.0.5.0 (build 17.0.5+8)</w:t>
       </w:r>
     </w:p>
     <w:p>
@@ -4951,14 +4936,12 @@
         </w:rPr>
         <w:t>参考として各種Java環境の入手先の例と、</w:t>
       </w:r>
-      <w:proofErr w:type="spellStart"/>
       <w:r>
         <w:rPr>
           <w:rFonts w:ascii="ＭＳ 明朝" w:hAnsi="ＭＳ 明朝"/>
         </w:rPr>
         <w:t>Adoptium</w:t>
       </w:r>
-      <w:proofErr w:type="spellEnd"/>
       <w:r>
         <w:rPr>
           <w:rFonts w:ascii="ＭＳ 明朝" w:hAnsi="ＭＳ 明朝" w:hint="eastAsia"/>
@@ -5070,14 +5053,12 @@
           <w:rFonts w:ascii="ＭＳ 明朝" w:hAnsi="ＭＳ 明朝"/>
         </w:rPr>
       </w:pPr>
-      <w:proofErr w:type="spellStart"/>
       <w:r>
         <w:rPr>
           <w:rFonts w:ascii="ＭＳ 明朝" w:hAnsi="ＭＳ 明朝" w:hint="eastAsia"/>
         </w:rPr>
         <w:t>Adoptium</w:t>
       </w:r>
-      <w:proofErr w:type="spellEnd"/>
       <w:r>
         <w:rPr>
           <w:rFonts w:ascii="ＭＳ 明朝" w:hAnsi="ＭＳ 明朝" w:hint="eastAsia"/>
@@ -5088,21 +5069,7 @@
         <w:rPr>
           <w:rFonts w:ascii="ＭＳ 明朝" w:hAnsi="ＭＳ 明朝"/>
         </w:rPr>
-        <w:t xml:space="preserve">(Eclipse </w:t>
-      </w:r>
-      <w:proofErr w:type="spellStart"/>
-      <w:r>
-        <w:rPr>
-          <w:rFonts w:ascii="ＭＳ 明朝" w:hAnsi="ＭＳ 明朝"/>
-        </w:rPr>
-        <w:t>Temurin</w:t>
-      </w:r>
-      <w:proofErr w:type="spellEnd"/>
-      <w:r>
-        <w:rPr>
-          <w:rFonts w:ascii="ＭＳ 明朝" w:hAnsi="ＭＳ 明朝"/>
-        </w:rPr>
-        <w:t>)</w:t>
+        <w:t>(Eclipse Temurin)</w:t>
       </w:r>
     </w:p>
     <w:p>
@@ -5153,14 +5120,12 @@
         </w:rPr>
         <w:t xml:space="preserve">(IBM </w:t>
       </w:r>
-      <w:proofErr w:type="spellStart"/>
       <w:r>
         <w:rPr>
           <w:rFonts w:ascii="ＭＳ 明朝" w:hAnsi="ＭＳ 明朝"/>
         </w:rPr>
         <w:t>Semeru</w:t>
       </w:r>
-      <w:proofErr w:type="spellEnd"/>
       <w:r>
         <w:rPr>
           <w:rFonts w:ascii="ＭＳ 明朝" w:hAnsi="ＭＳ 明朝"/>
@@ -5295,7 +5260,6 @@
         </w:rPr>
       </w:pPr>
       <w:bookmarkStart w:id="23" w:name="_Hlk128397837"/>
-      <w:proofErr w:type="spellStart"/>
       <w:r>
         <w:rPr>
           <w:rFonts w:ascii="HG丸ｺﾞｼｯｸM-PRO" w:eastAsia="HG丸ｺﾞｼｯｸM-PRO" w:hAnsi="HG丸ｺﾞｼｯｸM-PRO"/>
@@ -5303,7 +5267,6 @@
         </w:rPr>
         <w:t>Adoptium</w:t>
       </w:r>
-      <w:proofErr w:type="spellEnd"/>
       <w:r>
         <w:rPr>
           <w:rFonts w:ascii="HG丸ｺﾞｼｯｸM-PRO" w:eastAsia="HG丸ｺﾞｼｯｸM-PRO" w:hAnsi="HG丸ｺﾞｼｯｸM-PRO" w:hint="eastAsia"/>
@@ -5336,7 +5299,8 @@
         <w:ind w:left="1050"/>
         <w:jc w:val="left"/>
         <w:rPr>
-          <w:rFonts w:ascii="ＭＳ 明朝" w:hAnsi="ＭＳ 明朝"/>
+          <w:sz w:val="20"/>
+          <w:szCs w:val="22"/>
         </w:rPr>
       </w:pPr>
       <w:r>
@@ -5346,18 +5310,18 @@
         <mc:AlternateContent>
           <mc:Choice Requires="wps">
             <w:drawing>
-              <wp:anchor distT="0" distB="0" distL="114300" distR="114300" simplePos="0" relativeHeight="251662848" behindDoc="0" locked="0" layoutInCell="1" allowOverlap="1" wp14:anchorId="16CBEEC2" wp14:editId="4F89FEEB">
+              <wp:anchor distT="0" distB="0" distL="114300" distR="114300" simplePos="0" relativeHeight="251664896" behindDoc="0" locked="0" layoutInCell="1" allowOverlap="1" wp14:anchorId="3E1E8825" wp14:editId="3481070B">
                 <wp:simplePos x="0" y="0"/>
                 <wp:positionH relativeFrom="column">
-                  <wp:posOffset>4816475</wp:posOffset>
+                  <wp:posOffset>3109595</wp:posOffset>
                 </wp:positionH>
                 <wp:positionV relativeFrom="paragraph">
-                  <wp:posOffset>4456430</wp:posOffset>
+                  <wp:posOffset>4700270</wp:posOffset>
                 </wp:positionV>
-                <wp:extent cx="752475" cy="382905"/>
-                <wp:effectExtent l="20955" t="22860" r="17145" b="22860"/>
+                <wp:extent cx="1028700" cy="253365"/>
+                <wp:effectExtent l="19050" t="19050" r="19050" b="13335"/>
                 <wp:wrapNone/>
-                <wp:docPr id="9" name="AutoShape 678">
+                <wp:docPr id="2087519380" name="AutoShape 678">
                   <a:extLst xmlns:a="http://schemas.openxmlformats.org/drawingml/2006/main">
                     <a:ext uri="{C183D7F6-B498-43B3-948B-1728B52AA6E4}">
                       <adec:decorative xmlns:adec="http://schemas.microsoft.com/office/drawing/2017/decorative" val="1"/>
@@ -5376,7 +5340,7 @@
                       <wps:spPr bwMode="auto">
                         <a:xfrm>
                           <a:off x="0" y="0"/>
-                          <a:ext cx="752475" cy="382905"/>
+                          <a:ext cx="1028700" cy="253365"/>
                         </a:xfrm>
                         <a:prstGeom prst="roundRect">
                           <a:avLst>
@@ -5419,7 +5383,7 @@
           </mc:Choice>
           <mc:Fallback>
             <w:pict>
-              <v:roundrect w14:anchorId="3BD64553" id="AutoShape 678" o:spid="_x0000_s1026" alt="&quot;&quot;" style="position:absolute;left:0;text-align:left;margin-left:379.25pt;margin-top:350.9pt;width:59.25pt;height:30.15pt;z-index:251662848;visibility:visible;mso-wrap-style:square;mso-width-percent:0;mso-height-percent:0;mso-wrap-distance-left:9pt;mso-wrap-distance-top:0;mso-wrap-distance-right:9pt;mso-wrap-distance-bottom:0;mso-position-horizontal:absolute;mso-position-horizontal-relative:text;mso-position-vertical:absolute;mso-position-vertical-relative:text;mso-width-percent:0;mso-height-percent:0;mso-width-relative:page;mso-height-relative:page;v-text-anchor:top" arcsize="10923f" o:gfxdata="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" filled="f" strokecolor="red" strokeweight="2.25pt">
+              <v:roundrect w14:anchorId="716F235C" id="AutoShape 678" o:spid="_x0000_s1026" alt="&quot;&quot;" style="position:absolute;margin-left:244.85pt;margin-top:370.1pt;width:81pt;height:19.95pt;z-index:251664896;visibility:visible;mso-wrap-style:square;mso-width-percent:0;mso-height-percent:0;mso-wrap-distance-left:9pt;mso-wrap-distance-top:0;mso-wrap-distance-right:9pt;mso-wrap-distance-bottom:0;mso-position-horizontal:absolute;mso-position-horizontal-relative:text;mso-position-vertical:absolute;mso-position-vertical-relative:text;mso-width-percent:0;mso-height-percent:0;mso-width-relative:page;mso-height-relative:page;v-text-anchor:top" arcsize="10923f" o:gfxdata="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" filled="f" strokecolor="red" strokeweight="2.25pt">
                 <v:textbox inset="5.85pt,.7pt,5.85pt,.7pt"/>
               </v:roundrect>
             </w:pict>
@@ -5433,18 +5397,18 @@
         <mc:AlternateContent>
           <mc:Choice Requires="wps">
             <w:drawing>
-              <wp:anchor distT="0" distB="0" distL="114300" distR="114300" simplePos="0" relativeHeight="251661824" behindDoc="0" locked="0" layoutInCell="1" allowOverlap="1" wp14:anchorId="28934C5D" wp14:editId="7C055329">
+              <wp:anchor distT="0" distB="0" distL="114300" distR="114300" simplePos="0" relativeHeight="251662848" behindDoc="0" locked="0" layoutInCell="1" allowOverlap="1" wp14:anchorId="16CBEEC2" wp14:editId="468F18B3">
                 <wp:simplePos x="0" y="0"/>
                 <wp:positionH relativeFrom="column">
-                  <wp:posOffset>103505</wp:posOffset>
+                  <wp:posOffset>996950</wp:posOffset>
                 </wp:positionH>
                 <wp:positionV relativeFrom="paragraph">
-                  <wp:posOffset>3187700</wp:posOffset>
+                  <wp:posOffset>4675505</wp:posOffset>
                 </wp:positionV>
-                <wp:extent cx="6128385" cy="457200"/>
-                <wp:effectExtent l="22860" t="20955" r="20955" b="17145"/>
+                <wp:extent cx="455295" cy="253365"/>
+                <wp:effectExtent l="19050" t="19050" r="20955" b="13335"/>
                 <wp:wrapNone/>
-                <wp:docPr id="1" name="AutoShape 679">
+                <wp:docPr id="9" name="AutoShape 678">
                   <a:extLst xmlns:a="http://schemas.openxmlformats.org/drawingml/2006/main">
                     <a:ext uri="{C183D7F6-B498-43B3-948B-1728B52AA6E4}">
                       <adec:decorative xmlns:adec="http://schemas.microsoft.com/office/drawing/2017/decorative" val="1"/>
@@ -5463,7 +5427,7 @@
                       <wps:spPr bwMode="auto">
                         <a:xfrm>
                           <a:off x="0" y="0"/>
-                          <a:ext cx="6128385" cy="457200"/>
+                          <a:ext cx="455295" cy="253365"/>
                         </a:xfrm>
                         <a:prstGeom prst="roundRect">
                           <a:avLst>
@@ -5506,7 +5470,7 @@
           </mc:Choice>
           <mc:Fallback>
             <w:pict>
-              <v:roundrect w14:anchorId="444F5CCB" id="AutoShape 679" o:spid="_x0000_s1026" alt="&quot;&quot;" style="position:absolute;left:0;text-align:left;margin-left:8.15pt;margin-top:251pt;width:482.55pt;height:36pt;z-index:251661824;visibility:visible;mso-wrap-style:square;mso-width-percent:0;mso-height-percent:0;mso-wrap-distance-left:9pt;mso-wrap-distance-top:0;mso-wrap-distance-right:9pt;mso-wrap-distance-bottom:0;mso-position-horizontal:absolute;mso-position-horizontal-relative:text;mso-position-vertical:absolute;mso-position-vertical-relative:text;mso-width-percent:0;mso-height-percent:0;mso-width-relative:page;mso-height-relative:page;v-text-anchor:top" arcsize="10923f" o:gfxdata="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" filled="f" strokecolor="red" strokeweight="2.25pt">
+              <v:roundrect w14:anchorId="0360BA18" id="AutoShape 678" o:spid="_x0000_s1026" alt="&quot;&quot;" style="position:absolute;margin-left:78.5pt;margin-top:368.15pt;width:35.85pt;height:19.95pt;z-index:251662848;visibility:visible;mso-wrap-style:square;mso-width-percent:0;mso-height-percent:0;mso-wrap-distance-left:9pt;mso-wrap-distance-top:0;mso-wrap-distance-right:9pt;mso-wrap-distance-bottom:0;mso-position-horizontal:absolute;mso-position-horizontal-relative:text;mso-position-vertical:absolute;mso-position-vertical-relative:text;mso-width-percent:0;mso-height-percent:0;mso-width-relative:page;mso-height-relative:page;v-text-anchor:top" arcsize="10923f" o:gfxdata="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" filled="f" strokecolor="red" strokeweight="2.25pt">
                 <v:textbox inset="5.85pt,.7pt,5.85pt,.7pt"/>
               </v:roundrect>
             </w:pict>
@@ -5514,204 +5478,107 @@
         </mc:AlternateContent>
       </w:r>
       <w:r>
-        <w:t xml:space="preserve"> </w:t>
-      </w:r>
-      <w:r>
-        <w:rPr>
-          <w:rFonts w:ascii="ＭＳ 明朝" w:hAnsi="ＭＳ 明朝"/>
+        <w:rPr>
           <w:noProof/>
         </w:rPr>
-        <w:t>Adoptium</w:t>
-      </w:r>
-      <w:r>
-        <w:rPr>
-          <w:rFonts w:ascii="ＭＳ 明朝" w:hAnsi="ＭＳ 明朝" w:hint="eastAsia"/>
-        </w:rPr>
-        <w:t>の</w:t>
-      </w:r>
-      <w:r>
-        <w:rPr>
-          <w:rFonts w:ascii="ＭＳ 明朝" w:hAnsi="ＭＳ 明朝" w:hint="eastAsia"/>
-        </w:rPr>
-        <w:t>ダウンロードページ（</w:t>
-      </w:r>
-      <w:r>
-        <w:rPr>
-          <w:rFonts w:ascii="ＭＳ 明朝" w:hAnsi="ＭＳ 明朝" w:hint="eastAsia"/>
-        </w:rPr>
-        <w:t xml:space="preserve"> </w:t>
-      </w:r>
-      <w:hyperlink r:id="rId20" w:history="1">
-        <w:r>
-          <w:rPr>
-            <w:rStyle w:val="a4"/>
-          </w:rPr>
-          <w:t>https://adoptium.net/temurin/releases/</w:t>
-        </w:r>
-      </w:hyperlink>
-      <w:r>
-        <w:rPr>
-          <w:rFonts w:ascii="ＭＳ 明朝" w:hAnsi="ＭＳ 明朝"/>
-        </w:rPr>
-        <w:t xml:space="preserve"> </w:t>
-      </w:r>
-      <w:r>
-        <w:rPr>
-          <w:rFonts w:ascii="ＭＳ 明朝" w:hAnsi="ＭＳ 明朝" w:hint="eastAsia"/>
-        </w:rPr>
-        <w:t>）</w:t>
-      </w:r>
-      <w:r>
-        <w:rPr>
-          <w:rFonts w:ascii="ＭＳ 明朝" w:hAnsi="ＭＳ 明朝" w:hint="eastAsia"/>
-        </w:rPr>
-        <w:t xml:space="preserve"> </w:t>
-      </w:r>
-      <w:r>
-        <w:rPr>
-          <w:rFonts w:ascii="ＭＳ 明朝" w:hAnsi="ＭＳ 明朝" w:hint="eastAsia"/>
-        </w:rPr>
-        <w:t>にアクセスし、</w:t>
-      </w:r>
-      <w:r>
-        <w:rPr>
-          <w:rFonts w:ascii="ＭＳ 明朝" w:hAnsi="ＭＳ 明朝" w:hint="eastAsia"/>
-        </w:rPr>
-        <w:t>Operating Systemとして「Windows」、Architectureとして「</w:t>
-      </w:r>
-      <w:r>
-        <w:rPr>
-          <w:rFonts w:ascii="ＭＳ 明朝" w:hAnsi="ＭＳ 明朝"/>
-        </w:rPr>
-        <w:t>x64</w:t>
-      </w:r>
-      <w:r>
-        <w:rPr>
-          <w:rFonts w:ascii="ＭＳ 明朝" w:hAnsi="ＭＳ 明朝" w:hint="eastAsia"/>
-        </w:rPr>
-        <w:t>」（</w:t>
-      </w:r>
-      <w:r>
-        <w:rPr>
-          <w:rFonts w:ascii="ＭＳ 明朝" w:hAnsi="ＭＳ 明朝"/>
-        </w:rPr>
-        <w:t>64</w:t>
-      </w:r>
-      <w:r>
-        <w:rPr>
-          <w:rFonts w:ascii="ＭＳ 明朝" w:hAnsi="ＭＳ 明朝"/>
-        </w:rPr>
-        <w:t>bit</w:t>
-      </w:r>
-      <w:r>
-        <w:rPr>
-          <w:rFonts w:ascii="ＭＳ 明朝" w:hAnsi="ＭＳ 明朝" w:hint="eastAsia"/>
-        </w:rPr>
-        <w:t>版）</w:t>
-      </w:r>
-      <w:r>
-        <w:rPr>
-          <w:rFonts w:ascii="ＭＳ 明朝" w:hAnsi="ＭＳ 明朝" w:hint="eastAsia"/>
-        </w:rPr>
-        <w:t>、Package Typeとして「JRE」、Versionとして「17」</w:t>
-      </w:r>
-      <w:r>
-        <w:rPr>
-          <w:rFonts w:ascii="ＭＳ 明朝" w:hAnsi="ＭＳ 明朝" w:hint="eastAsia"/>
-        </w:rPr>
-        <w:t>を選択した上で、</w:t>
-      </w:r>
-      <w:r>
-        <w:rPr>
-          <w:rFonts w:ascii="ＭＳ 明朝" w:hAnsi="ＭＳ 明朝" w:hint="eastAsia"/>
-        </w:rPr>
-        <w:t>圧縮形式の</w:t>
-      </w:r>
-      <w:r>
-        <w:rPr>
-          <w:rFonts w:ascii="ＭＳ 明朝" w:hAnsi="ＭＳ 明朝" w:hint="eastAsia"/>
-        </w:rPr>
-        <w:t>JRE（Java実行環境）の</w:t>
-      </w:r>
-      <w:r>
-        <w:rPr>
-          <w:rFonts w:ascii="ＭＳ 明朝" w:hAnsi="ＭＳ 明朝" w:hint="eastAsia"/>
-        </w:rPr>
-        <w:t>ダウンロードのための</w:t>
-      </w:r>
-      <w:r>
-        <w:rPr>
-          <w:rFonts w:ascii="ＭＳ 明朝" w:hAnsi="ＭＳ 明朝" w:hint="eastAsia"/>
-        </w:rPr>
-        <w:t>リンク</w:t>
-      </w:r>
-      <w:r>
-        <w:rPr>
-          <w:rFonts w:ascii="ＭＳ 明朝" w:hAnsi="ＭＳ 明朝" w:hint="eastAsia"/>
-        </w:rPr>
-        <w:t>「</w:t>
-      </w:r>
-      <w:r>
-        <w:rPr>
-          <w:rFonts w:ascii="ＭＳ 明朝" w:hAnsi="ＭＳ 明朝" w:hint="eastAsia"/>
-        </w:rPr>
-        <w:t>z</w:t>
-      </w:r>
-      <w:r>
-        <w:rPr>
-          <w:rFonts w:ascii="ＭＳ 明朝" w:hAnsi="ＭＳ 明朝"/>
-        </w:rPr>
-        <w:t>ip</w:t>
-      </w:r>
-      <w:r>
-        <w:rPr>
-          <w:rFonts w:ascii="ＭＳ 明朝" w:hAnsi="ＭＳ 明朝" w:hint="eastAsia"/>
-        </w:rPr>
-        <w:t>」</w:t>
-      </w:r>
-      <w:r>
-        <w:rPr>
-          <w:rFonts w:ascii="ＭＳ 明朝" w:hAnsi="ＭＳ 明朝" w:hint="eastAsia"/>
-        </w:rPr>
-        <w:t>を</w:t>
-      </w:r>
-      <w:r>
-        <w:rPr>
-          <w:rFonts w:ascii="ＭＳ 明朝" w:hAnsi="ＭＳ 明朝" w:hint="eastAsia"/>
-        </w:rPr>
-        <w:t>選択</w:t>
-      </w:r>
-      <w:r>
-        <w:rPr>
-          <w:rFonts w:ascii="ＭＳ 明朝" w:hAnsi="ＭＳ 明朝" w:hint="eastAsia"/>
-        </w:rPr>
-        <w:t>してください。</w:t>
-      </w:r>
-    </w:p>
-    <w:p>
-      <w:pPr>
-        <w:pStyle w:val="ab"/>
-        <w:jc w:val="center"/>
-        <w:rPr>
-          <w:rFonts w:ascii="HG丸ｺﾞｼｯｸM-PRO" w:eastAsia="HG丸ｺﾞｼｯｸM-PRO" w:hAnsi="HG丸ｺﾞｼｯｸM-PRO"/>
-          <w:b w:val="0"/>
-        </w:rPr>
-      </w:pPr>
+        <mc:AlternateContent>
+          <mc:Choice Requires="wps">
+            <w:drawing>
+              <wp:anchor distT="0" distB="0" distL="114300" distR="114300" simplePos="0" relativeHeight="251661824" behindDoc="0" locked="0" layoutInCell="1" allowOverlap="1" wp14:anchorId="28934C5D" wp14:editId="2F109D0C">
+                <wp:simplePos x="0" y="0"/>
+                <wp:positionH relativeFrom="column">
+                  <wp:posOffset>208280</wp:posOffset>
+                </wp:positionH>
+                <wp:positionV relativeFrom="paragraph">
+                  <wp:posOffset>2025650</wp:posOffset>
+                </wp:positionV>
+                <wp:extent cx="6006465" cy="457200"/>
+                <wp:effectExtent l="19050" t="19050" r="13335" b="19050"/>
+                <wp:wrapNone/>
+                <wp:docPr id="1" name="AutoShape 679">
+                  <a:extLst xmlns:a="http://schemas.openxmlformats.org/drawingml/2006/main">
+                    <a:ext uri="{C183D7F6-B498-43B3-948B-1728B52AA6E4}">
+                      <adec:decorative xmlns:adec="http://schemas.microsoft.com/office/drawing/2017/decorative" val="1"/>
+                    </a:ext>
+                  </a:extLst>
+                </wp:docPr>
+                <wp:cNvGraphicFramePr>
+                  <a:graphicFrameLocks xmlns:a="http://schemas.openxmlformats.org/drawingml/2006/main"/>
+                </wp:cNvGraphicFramePr>
+                <a:graphic xmlns:a="http://schemas.openxmlformats.org/drawingml/2006/main">
+                  <a:graphicData uri="http://schemas.microsoft.com/office/word/2010/wordprocessingShape">
+                    <wps:wsp>
+                      <wps:cNvSpPr>
+                        <a:spLocks noChangeArrowheads="1"/>
+                      </wps:cNvSpPr>
+                      <wps:spPr bwMode="auto">
+                        <a:xfrm>
+                          <a:off x="0" y="0"/>
+                          <a:ext cx="6006465" cy="457200"/>
+                        </a:xfrm>
+                        <a:prstGeom prst="roundRect">
+                          <a:avLst>
+                            <a:gd name="adj" fmla="val 16667"/>
+                          </a:avLst>
+                        </a:prstGeom>
+                        <a:noFill/>
+                        <a:ln w="28575">
+                          <a:solidFill>
+                            <a:srgbClr val="FF0000"/>
+                          </a:solidFill>
+                          <a:round/>
+                          <a:headEnd/>
+                          <a:tailEnd/>
+                        </a:ln>
+                        <a:extLst>
+                          <a:ext uri="{909E8E84-426E-40DD-AFC4-6F175D3DCCD1}">
+                            <a14:hiddenFill xmlns:a14="http://schemas.microsoft.com/office/drawing/2010/main">
+                              <a:solidFill>
+                                <a:srgbClr val="FFFFFF"/>
+                              </a:solidFill>
+                            </a14:hiddenFill>
+                          </a:ext>
+                        </a:extLst>
+                      </wps:spPr>
+                      <wps:bodyPr rot="0" vert="horz" wrap="square" lIns="74295" tIns="8890" rIns="74295" bIns="8890" anchor="t" anchorCtr="0" upright="1">
+                        <a:noAutofit/>
+                      </wps:bodyPr>
+                    </wps:wsp>
+                  </a:graphicData>
+                </a:graphic>
+                <wp14:sizeRelH relativeFrom="page">
+                  <wp14:pctWidth>0</wp14:pctWidth>
+                </wp14:sizeRelH>
+                <wp14:sizeRelV relativeFrom="page">
+                  <wp14:pctHeight>0</wp14:pctHeight>
+                </wp14:sizeRelV>
+              </wp:anchor>
+            </w:drawing>
+          </mc:Choice>
+          <mc:Fallback>
+            <w:pict>
+              <v:roundrect w14:anchorId="35F9135C" id="AutoShape 679" o:spid="_x0000_s1026" alt="&quot;&quot;" style="position:absolute;margin-left:16.4pt;margin-top:159.5pt;width:472.95pt;height:36pt;z-index:251661824;visibility:visible;mso-wrap-style:square;mso-width-percent:0;mso-height-percent:0;mso-wrap-distance-left:9pt;mso-wrap-distance-top:0;mso-wrap-distance-right:9pt;mso-wrap-distance-bottom:0;mso-position-horizontal:absolute;mso-position-horizontal-relative:text;mso-position-vertical:absolute;mso-position-vertical-relative:text;mso-width-percent:0;mso-height-percent:0;mso-width-relative:page;mso-height-relative:page;v-text-anchor:top" arcsize="10923f" o:gfxdata="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" filled="f" strokecolor="red" strokeweight="2.25pt">
+                <v:textbox inset="5.85pt,.7pt,5.85pt,.7pt"/>
+              </v:roundrect>
+            </w:pict>
+          </mc:Fallback>
+        </mc:AlternateContent>
+      </w:r>
       <w:r>
         <w:rPr>
           <w:noProof/>
         </w:rPr>
         <w:drawing>
-          <wp:anchor distT="0" distB="0" distL="114300" distR="114300" simplePos="0" relativeHeight="251651584" behindDoc="0" locked="0" layoutInCell="1" allowOverlap="1" wp14:anchorId="35E554FE" wp14:editId="73544B45">
+          <wp:anchor distT="0" distB="0" distL="114300" distR="114300" simplePos="0" relativeHeight="251651584" behindDoc="0" locked="0" layoutInCell="1" allowOverlap="1" wp14:anchorId="35E554FE" wp14:editId="37793906">
             <wp:simplePos x="0" y="0"/>
             <wp:positionH relativeFrom="column">
-              <wp:posOffset>67310</wp:posOffset>
+              <wp:posOffset>348615</wp:posOffset>
             </wp:positionH>
             <wp:positionV relativeFrom="paragraph">
-              <wp:posOffset>44450</wp:posOffset>
+              <wp:posOffset>1414145</wp:posOffset>
             </wp:positionV>
-            <wp:extent cx="6286500" cy="4114800"/>
-            <wp:effectExtent l="19050" t="19050" r="0" b="0"/>
+            <wp:extent cx="5730240" cy="4114800"/>
+            <wp:effectExtent l="19050" t="19050" r="22860" b="19050"/>
             <wp:wrapTopAndBottom/>
             <wp:docPr id="681" name="図 681">
               <a:extLst xmlns:a="http://schemas.openxmlformats.org/drawingml/2006/main">
@@ -5739,14 +5606,13 @@
                     </pic:cNvPicPr>
                   </pic:nvPicPr>
                   <pic:blipFill>
-                    <a:blip r:embed="rId21">
+                    <a:blip r:embed="rId20">
                       <a:extLst>
                         <a:ext uri="{28A0092B-C50C-407E-A947-70E740481C1C}">
                           <a14:useLocalDpi xmlns:a14="http://schemas.microsoft.com/office/drawing/2010/main" val="0"/>
                         </a:ext>
                       </a:extLst>
                     </a:blip>
-                    <a:srcRect/>
                     <a:stretch>
                       <a:fillRect/>
                     </a:stretch>
@@ -5754,7 +5620,7 @@
                   <pic:spPr bwMode="auto">
                     <a:xfrm>
                       <a:off x="0" y="0"/>
-                      <a:ext cx="6286500" cy="4114800"/>
+                      <a:ext cx="5730240" cy="4114800"/>
                     </a:xfrm>
                     <a:prstGeom prst="rect">
                       <a:avLst/>
@@ -5782,6 +5648,226 @@
         </w:drawing>
       </w:r>
       <w:r>
+        <w:t xml:space="preserve"> </w:t>
+      </w:r>
+      <w:r>
+        <w:rPr>
+          <w:rFonts w:ascii="ＭＳ 明朝" w:hAnsi="ＭＳ 明朝"/>
+          <w:noProof/>
+        </w:rPr>
+        <w:t>Adoptium</w:t>
+      </w:r>
+      <w:r>
+        <w:rPr>
+          <w:rFonts w:ascii="ＭＳ 明朝" w:hAnsi="ＭＳ 明朝" w:hint="eastAsia"/>
+        </w:rPr>
+        <w:t>の</w:t>
+      </w:r>
+      <w:r>
+        <w:rPr>
+          <w:rFonts w:ascii="ＭＳ 明朝" w:hAnsi="ＭＳ 明朝" w:hint="eastAsia"/>
+        </w:rPr>
+        <w:t>ダウンロードページ</w:t>
+      </w:r>
+      <w:r>
+        <w:rPr>
+          <w:rFonts w:ascii="ＭＳ 明朝" w:hAnsi="ＭＳ 明朝" w:hint="eastAsia"/>
+          <w:sz w:val="20"/>
+          <w:szCs w:val="22"/>
+        </w:rPr>
+        <w:t>（</w:t>
+      </w:r>
+      <w:hyperlink r:id="rId21" w:history="1">
+        <w:r>
+          <w:rPr>
+            <w:rStyle w:val="a4"/>
+            <w:sz w:val="20"/>
+            <w:szCs w:val="22"/>
+          </w:rPr>
+          <w:t>https://adoptium.net/ja/temurin/releases?version=17&amp;os=windows&amp;arch=x64&amp;mode=filter</w:t>
+        </w:r>
+      </w:hyperlink>
+      <w:r>
+        <w:rPr>
+          <w:rFonts w:ascii="ＭＳ 明朝" w:hAnsi="ＭＳ 明朝" w:hint="eastAsia"/>
+          <w:sz w:val="20"/>
+          <w:szCs w:val="22"/>
+        </w:rPr>
+        <w:t>）</w:t>
+      </w:r>
+      <w:r>
+        <w:rPr>
+          <w:rFonts w:ascii="ＭＳ 明朝" w:hAnsi="ＭＳ 明朝" w:hint="eastAsia"/>
+        </w:rPr>
+        <w:t xml:space="preserve"> </w:t>
+      </w:r>
+      <w:r>
+        <w:rPr>
+          <w:rFonts w:ascii="ＭＳ 明朝" w:hAnsi="ＭＳ 明朝" w:hint="eastAsia"/>
+        </w:rPr>
+        <w:t>にアクセスし</w:t>
+      </w:r>
+      <w:r>
+        <w:rPr>
+          <w:rFonts w:ascii="ＭＳ 明朝" w:hAnsi="ＭＳ 明朝" w:hint="eastAsia"/>
+        </w:rPr>
+        <w:t>、バージョン</w:t>
+      </w:r>
+      <w:r>
+        <w:rPr>
+          <w:rFonts w:ascii="ＭＳ 明朝" w:hAnsi="ＭＳ 明朝" w:hint="eastAsia"/>
+        </w:rPr>
+        <w:t>「17</w:t>
+      </w:r>
+      <w:r>
+        <w:rPr>
+          <w:rFonts w:ascii="ＭＳ 明朝" w:hAnsi="ＭＳ 明朝" w:hint="eastAsia"/>
+        </w:rPr>
+        <w:t xml:space="preserve"> - LTS</w:t>
+      </w:r>
+      <w:r>
+        <w:rPr>
+          <w:rFonts w:ascii="ＭＳ 明朝" w:hAnsi="ＭＳ 明朝" w:hint="eastAsia"/>
+        </w:rPr>
+        <w:t>」</w:t>
+      </w:r>
+      <w:r>
+        <w:rPr>
+          <w:rFonts w:ascii="ＭＳ 明朝" w:hAnsi="ＭＳ 明朝" w:hint="eastAsia"/>
+        </w:rPr>
+        <w:t>、オペレーティングシステム</w:t>
+      </w:r>
+      <w:r>
+        <w:rPr>
+          <w:rFonts w:ascii="ＭＳ 明朝" w:hAnsi="ＭＳ 明朝" w:hint="eastAsia"/>
+        </w:rPr>
+        <w:t>「Windows」、</w:t>
+      </w:r>
+      <w:r>
+        <w:rPr>
+          <w:rFonts w:ascii="ＭＳ 明朝" w:hAnsi="ＭＳ 明朝" w:hint="eastAsia"/>
+        </w:rPr>
+        <w:t>アーキテクチャ</w:t>
+      </w:r>
+      <w:r>
+        <w:rPr>
+          <w:rFonts w:ascii="ＭＳ 明朝" w:hAnsi="ＭＳ 明朝" w:hint="eastAsia"/>
+        </w:rPr>
+        <w:t>「</w:t>
+      </w:r>
+      <w:r>
+        <w:rPr>
+          <w:rFonts w:ascii="ＭＳ 明朝" w:hAnsi="ＭＳ 明朝"/>
+        </w:rPr>
+        <w:t>x64</w:t>
+      </w:r>
+      <w:r>
+        <w:rPr>
+          <w:rFonts w:ascii="ＭＳ 明朝" w:hAnsi="ＭＳ 明朝" w:hint="eastAsia"/>
+        </w:rPr>
+        <w:t>」（</w:t>
+      </w:r>
+      <w:r>
+        <w:rPr>
+          <w:rFonts w:ascii="ＭＳ 明朝" w:hAnsi="ＭＳ 明朝"/>
+        </w:rPr>
+        <w:t>64</w:t>
+      </w:r>
+      <w:r>
+        <w:rPr>
+          <w:rFonts w:ascii="ＭＳ 明朝" w:hAnsi="ＭＳ 明朝"/>
+        </w:rPr>
+        <w:t>bit</w:t>
+      </w:r>
+      <w:r>
+        <w:rPr>
+          <w:rFonts w:ascii="ＭＳ 明朝" w:hAnsi="ＭＳ 明朝" w:hint="eastAsia"/>
+        </w:rPr>
+        <w:t>版）</w:t>
+      </w:r>
+      <w:r>
+        <w:rPr>
+          <w:rFonts w:ascii="ＭＳ 明朝" w:hAnsi="ＭＳ 明朝" w:hint="eastAsia"/>
+        </w:rPr>
+        <w:t>が選択されていることを確認した上で、JDK（Java開発環境）と</w:t>
+      </w:r>
+      <w:r>
+        <w:rPr>
+          <w:rFonts w:ascii="ＭＳ 明朝" w:hAnsi="ＭＳ 明朝" w:hint="eastAsia"/>
+        </w:rPr>
+        <w:t>JRE</w:t>
+      </w:r>
+      <w:r>
+        <w:rPr>
+          <w:rFonts w:ascii="ＭＳ 明朝" w:hAnsi="ＭＳ 明朝" w:hint="eastAsia"/>
+        </w:rPr>
+        <w:t>（Java実行環境）</w:t>
+      </w:r>
+      <w:r>
+        <w:rPr>
+          <w:rFonts w:ascii="ＭＳ 明朝" w:hAnsi="ＭＳ 明朝" w:hint="eastAsia"/>
+        </w:rPr>
+        <w:t>の選択肢から「JRE」</w:t>
+      </w:r>
+      <w:r>
+        <w:rPr>
+          <w:rFonts w:ascii="ＭＳ 明朝" w:hAnsi="ＭＳ 明朝" w:hint="eastAsia"/>
+        </w:rPr>
+        <w:t>を選択した上で、</w:t>
+      </w:r>
+      <w:r>
+        <w:rPr>
+          <w:rFonts w:ascii="ＭＳ 明朝" w:hAnsi="ＭＳ 明朝" w:hint="eastAsia"/>
+        </w:rPr>
+        <w:t>圧縮形式</w:t>
+      </w:r>
+      <w:r>
+        <w:rPr>
+          <w:rFonts w:ascii="ＭＳ 明朝" w:hAnsi="ＭＳ 明朝" w:hint="eastAsia"/>
+        </w:rPr>
+        <w:t>「ZIP」</w:t>
+      </w:r>
+      <w:r>
+        <w:rPr>
+          <w:rFonts w:ascii="ＭＳ 明朝" w:hAnsi="ＭＳ 明朝" w:hint="eastAsia"/>
+        </w:rPr>
+        <w:t>版の</w:t>
+      </w:r>
+      <w:r>
+        <w:rPr>
+          <w:rFonts w:ascii="ＭＳ 明朝" w:hAnsi="ＭＳ 明朝" w:hint="eastAsia"/>
+        </w:rPr>
+        <w:t>ダウンロードのための</w:t>
+      </w:r>
+      <w:r>
+        <w:rPr>
+          <w:rFonts w:ascii="ＭＳ 明朝" w:hAnsi="ＭＳ 明朝" w:hint="eastAsia"/>
+        </w:rPr>
+        <w:t>リンクを</w:t>
+      </w:r>
+      <w:r>
+        <w:rPr>
+          <w:rFonts w:ascii="ＭＳ 明朝" w:hAnsi="ＭＳ 明朝" w:hint="eastAsia"/>
+        </w:rPr>
+        <w:t>選択</w:t>
+      </w:r>
+      <w:r>
+        <w:rPr>
+          <w:rFonts w:ascii="ＭＳ 明朝" w:hAnsi="ＭＳ 明朝" w:hint="eastAsia"/>
+        </w:rPr>
+        <w:t>してください。</w:t>
+      </w:r>
+    </w:p>
+    <w:p>
+      <w:pPr>
+        <w:pStyle w:val="ab"/>
+        <w:jc w:val="center"/>
+        <w:rPr>
+          <w:rFonts w:ascii="HG丸ｺﾞｼｯｸM-PRO" w:eastAsia="HG丸ｺﾞｼｯｸM-PRO" w:hAnsi="HG丸ｺﾞｼｯｸM-PRO"/>
+          <w:b w:val="0"/>
+        </w:rPr>
+      </w:pPr>
+      <w:r>
         <w:rPr>
           <w:rFonts w:hint="eastAsia"/>
         </w:rPr>
@@ -5935,14 +6021,7 @@
         <w:rPr>
           <w:rFonts w:ascii="ＭＳ 明朝" w:hAnsi="ＭＳ 明朝" w:hint="eastAsia"/>
         </w:rPr>
-        <w:t>展開されたフォルダー内に、Java実行環境が入ったフォルダー（「</w:t>
-      </w:r>
-      <w:proofErr w:type="spellStart"/>
-      <w:r>
-        <w:rPr>
-          <w:rFonts w:ascii="ＭＳ 明朝" w:hAnsi="ＭＳ 明朝" w:hint="eastAsia"/>
-        </w:rPr>
-        <w:t>j</w:t>
+        <w:t>展開されたフォルダー内に、Java実行環境が入ったフォルダー（「j</w:t>
       </w:r>
       <w:r>
         <w:rPr>
@@ -5950,21 +6029,18 @@
         </w:rPr>
         <w:t>dk</w:t>
       </w:r>
-      <w:proofErr w:type="spellEnd"/>
       <w:r>
         <w:rPr>
           <w:rFonts w:ascii="ＭＳ 明朝" w:hAnsi="ＭＳ 明朝" w:hint="eastAsia"/>
         </w:rPr>
         <w:t>」で始まり「</w:t>
       </w:r>
-      <w:proofErr w:type="spellStart"/>
       <w:r>
         <w:rPr>
           <w:rFonts w:ascii="ＭＳ 明朝" w:hAnsi="ＭＳ 明朝"/>
         </w:rPr>
         <w:t>jre</w:t>
       </w:r>
-      <w:proofErr w:type="spellEnd"/>
       <w:r>
         <w:rPr>
           <w:rFonts w:ascii="ＭＳ 明朝" w:hAnsi="ＭＳ 明朝" w:hint="eastAsia"/>
@@ -6062,14 +6138,7 @@
         <w:rPr>
           <w:rFonts w:ascii="ＭＳ 明朝" w:hAnsi="ＭＳ 明朝" w:hint="eastAsia"/>
         </w:rPr>
-        <w:t>「</w:t>
-      </w:r>
-      <w:proofErr w:type="spellStart"/>
-      <w:r>
-        <w:rPr>
-          <w:rFonts w:ascii="ＭＳ 明朝" w:hAnsi="ＭＳ 明朝" w:hint="eastAsia"/>
-        </w:rPr>
-        <w:t>j</w:t>
+        <w:t>「j</w:t>
       </w:r>
       <w:r>
         <w:rPr>
@@ -6077,21 +6146,18 @@
         </w:rPr>
         <w:t>dk</w:t>
       </w:r>
-      <w:proofErr w:type="spellEnd"/>
       <w:r>
         <w:rPr>
           <w:rFonts w:ascii="ＭＳ 明朝" w:hAnsi="ＭＳ 明朝" w:hint="eastAsia"/>
         </w:rPr>
         <w:t>」で始まり「</w:t>
       </w:r>
-      <w:proofErr w:type="spellStart"/>
       <w:r>
         <w:rPr>
           <w:rFonts w:ascii="ＭＳ 明朝" w:hAnsi="ＭＳ 明朝"/>
         </w:rPr>
         <w:t>jre</w:t>
       </w:r>
-      <w:proofErr w:type="spellEnd"/>
       <w:r>
         <w:rPr>
           <w:rFonts w:ascii="ＭＳ 明朝" w:hAnsi="ＭＳ 明朝" w:hint="eastAsia"/>
@@ -6126,14 +6192,7 @@
         <w:rPr>
           <w:rFonts w:ascii="ＭＳ 明朝" w:hAnsi="ＭＳ 明朝" w:hint="eastAsia"/>
         </w:rPr>
-        <w:t>【名前の変更(M)】を選択し、フォルダーの名前を「</w:t>
-      </w:r>
-      <w:proofErr w:type="spellStart"/>
-      <w:r>
-        <w:rPr>
-          <w:rFonts w:ascii="ＭＳ 明朝" w:hAnsi="ＭＳ 明朝" w:hint="eastAsia"/>
-        </w:rPr>
-        <w:t>j</w:t>
+        <w:t>【名前の変更(M)】を選択し、フォルダーの名前を「j</w:t>
       </w:r>
       <w:r>
         <w:rPr>
@@ -6141,19 +6200,11 @@
         </w:rPr>
         <w:t>re</w:t>
       </w:r>
-      <w:proofErr w:type="spellEnd"/>
-      <w:r>
-        <w:rPr>
-          <w:rFonts w:ascii="ＭＳ 明朝" w:hAnsi="ＭＳ 明朝" w:hint="eastAsia"/>
-        </w:rPr>
-        <w:t>」に変更します。次に、「</w:t>
-      </w:r>
-      <w:proofErr w:type="spellStart"/>
-      <w:r>
-        <w:rPr>
-          <w:rFonts w:ascii="ＭＳ 明朝" w:hAnsi="ＭＳ 明朝" w:hint="eastAsia"/>
-        </w:rPr>
-        <w:t>j</w:t>
+      <w:r>
+        <w:rPr>
+          <w:rFonts w:ascii="ＭＳ 明朝" w:hAnsi="ＭＳ 明朝" w:hint="eastAsia"/>
+        </w:rPr>
+        <w:t>」に変更します。次に、「j</w:t>
       </w:r>
       <w:r>
         <w:rPr>
@@ -6161,7 +6212,6 @@
         </w:rPr>
         <w:t>re</w:t>
       </w:r>
-      <w:proofErr w:type="spellEnd"/>
       <w:r>
         <w:rPr>
           <w:rFonts w:ascii="ＭＳ 明朝" w:hAnsi="ＭＳ 明朝" w:hint="eastAsia"/>
@@ -6302,7 +6352,13 @@
         <w:rPr>
           <w:rFonts w:ascii="ＭＳ 明朝" w:hAnsi="ＭＳ 明朝"/>
         </w:rPr>
-        <w:t>_1</w:t>
+        <w:t>_</w:t>
+      </w:r>
+      <w:r>
+        <w:rPr>
+          <w:rFonts w:ascii="ＭＳ 明朝" w:hAnsi="ＭＳ 明朝" w:hint="eastAsia"/>
+        </w:rPr>
+        <w:t>2</w:t>
       </w:r>
       <w:r>
         <w:rPr>
@@ -6347,14 +6403,7 @@
         <w:rPr>
           <w:rFonts w:ascii="ＭＳ 明朝" w:hAnsi="ＭＳ 明朝" w:hint="eastAsia"/>
         </w:rPr>
-        <w:t>のフォルダー内の古い「</w:t>
-      </w:r>
-      <w:proofErr w:type="spellStart"/>
-      <w:r>
-        <w:rPr>
-          <w:rFonts w:ascii="ＭＳ 明朝" w:hAnsi="ＭＳ 明朝" w:hint="eastAsia"/>
-        </w:rPr>
-        <w:t>j</w:t>
+        <w:t>のフォルダー内の古い「j</w:t>
       </w:r>
       <w:r>
         <w:rPr>
@@ -6362,21 +6411,18 @@
         </w:rPr>
         <w:t>re</w:t>
       </w:r>
-      <w:proofErr w:type="spellEnd"/>
       <w:r>
         <w:rPr>
           <w:rFonts w:ascii="ＭＳ 明朝" w:hAnsi="ＭＳ 明朝" w:hint="eastAsia"/>
         </w:rPr>
         <w:t>」フォルダーを削除した後、新しい「</w:t>
       </w:r>
-      <w:proofErr w:type="spellStart"/>
       <w:r>
         <w:rPr>
           <w:rFonts w:ascii="ＭＳ 明朝" w:hAnsi="ＭＳ 明朝"/>
         </w:rPr>
         <w:t>jre</w:t>
       </w:r>
-      <w:proofErr w:type="spellEnd"/>
       <w:r>
         <w:rPr>
           <w:rFonts w:ascii="ＭＳ 明朝" w:hAnsi="ＭＳ 明朝" w:hint="eastAsia"/>
@@ -6546,15 +6592,17 @@
         <w:t>_</w:t>
       </w:r>
       <w:r>
-        <w:t>1</w:t>
-      </w:r>
-      <w:r>
         <w:rPr>
           <w:rFonts w:hint="eastAsia"/>
         </w:rPr>
+        <w:t>2</w:t>
+      </w:r>
+      <w:r>
+        <w:rPr>
+          <w:rFonts w:hint="eastAsia"/>
+        </w:rPr>
         <w:t>」フォルダーに「</w:t>
       </w:r>
-      <w:proofErr w:type="spellStart"/>
       <w:r>
         <w:rPr>
           <w:rFonts w:hint="eastAsia"/>
@@ -6564,7 +6612,6 @@
       <w:r>
         <w:t>re</w:t>
       </w:r>
-      <w:proofErr w:type="spellEnd"/>
       <w:r>
         <w:rPr>
           <w:rFonts w:hint="eastAsia"/>
@@ -10978,7 +11025,6 @@
   <w:style w:type="character" w:default="1" w:styleId="a0">
     <w:name w:val="Default Paragraph Font"/>
     <w:uiPriority w:val="1"/>
-    <w:semiHidden/>
     <w:unhideWhenUsed/>
   </w:style>
   <w:style w:type="table" w:default="1" w:styleId="a1">

</xml_diff>